<commit_message>
Actualiza CV y portfolio con Banco Horizonte
</commit_message>
<xml_diff>
--- a/app/frontend/public/cv-cristhian.docx
+++ b/app/frontend/public/cv-cristhian.docx
@@ -142,65 +142,65 @@
         <w:spacing w:after="200"/>
       </w:pPr>
       <w:r>
-        <w:t xml:space="preserve">Estudiante de Ingeniería de Software con experiencia práctica en proyectos full </w:t>
-      </w:r>
-      <w:proofErr w:type="spellStart"/>
-      <w:r>
-        <w:t>stack</w:t>
-      </w:r>
-      <w:proofErr w:type="spellEnd"/>
-      <w:r>
-        <w:t xml:space="preserve"> y </w:t>
-      </w:r>
-      <w:proofErr w:type="spellStart"/>
-      <w:r>
-        <w:t>backend</w:t>
-      </w:r>
-      <w:proofErr w:type="spellEnd"/>
-      <w:r>
-        <w:t xml:space="preserve"> desarrollados con Java, Spring Boot, </w:t>
-      </w:r>
-      <w:proofErr w:type="spellStart"/>
-      <w:r>
-        <w:t>React</w:t>
-      </w:r>
-      <w:proofErr w:type="spellEnd"/>
-      <w:r>
-        <w:t xml:space="preserve">, C# y .NET. Segundo lugar en hackathon con una plataforma para procesamiento y monitoreo de transacciones mediante Spring Boot, Next.js y MySQL. </w:t>
-      </w:r>
-      <w:proofErr w:type="spellStart"/>
-      <w:r>
-        <w:t>Constucción</w:t>
-      </w:r>
-      <w:proofErr w:type="spellEnd"/>
-      <w:r>
-        <w:t xml:space="preserve"> de </w:t>
-      </w:r>
-      <w:proofErr w:type="spellStart"/>
-      <w:r>
-        <w:t>APIs</w:t>
-      </w:r>
-      <w:proofErr w:type="spellEnd"/>
-      <w:r>
-        <w:t xml:space="preserve"> REST y soluciones mantenibles, aplicando fundamentos de arquitectura limpia, SOLID y bases de datos relacionales. Busco </w:t>
-      </w:r>
-      <w:r>
-        <w:t>potenciar</w:t>
-      </w:r>
-      <w:r>
-        <w:t xml:space="preserve"> mi</w:t>
-      </w:r>
-      <w:r>
-        <w:t xml:space="preserve">s conocimientos </w:t>
-      </w:r>
-      <w:r>
-        <w:t>como y aportar</w:t>
-      </w:r>
-      <w:r>
-        <w:t xml:space="preserve"> con </w:t>
-      </w:r>
-      <w:r>
-        <w:t>criterio técnico y disciplina de desarrollo.</w:t>
+        <w:t xml:space="preserve">Estudiante de Ingeniería de Software con experiencia práctica en proyectos full stack y backend desarrollados con Java, Spring Boot, React, C# y .NET. Segundo lugar en hackathon con una plataforma para procesamiento y monitoreo de transacciones mediante Spring Boot, Next.js y MySQL. Construyo APIs REST y soluciones mantenibles, aplicando fundamentos de arquitectura limpia, SOLID y bases de datos relacionales. Busco potenciar mis conocimientos y aportar con criterio técnico y disciplina de desarrollo.</w:t>
+      </w:r>
+      <w:proofErr w:type="spellStart"/>
+      <w:r>
+        <w:t/>
+      </w:r>
+      <w:proofErr w:type="spellEnd"/>
+      <w:r>
+        <w:t xml:space="preserve"/>
+      </w:r>
+      <w:proofErr w:type="spellStart"/>
+      <w:r>
+        <w:t/>
+      </w:r>
+      <w:proofErr w:type="spellEnd"/>
+      <w:r>
+        <w:t xml:space="preserve"/>
+      </w:r>
+      <w:proofErr w:type="spellStart"/>
+      <w:r>
+        <w:t/>
+      </w:r>
+      <w:proofErr w:type="spellEnd"/>
+      <w:r>
+        <w:t xml:space="preserve"/>
+      </w:r>
+      <w:proofErr w:type="spellStart"/>
+      <w:r>
+        <w:t/>
+      </w:r>
+      <w:proofErr w:type="spellEnd"/>
+      <w:r>
+        <w:t xml:space="preserve"/>
+      </w:r>
+      <w:proofErr w:type="spellStart"/>
+      <w:r>
+        <w:t/>
+      </w:r>
+      <w:proofErr w:type="spellEnd"/>
+      <w:r>
+        <w:t xml:space="preserve"/>
+      </w:r>
+      <w:r>
+        <w:t/>
+      </w:r>
+      <w:r>
+        <w:t xml:space="preserve"/>
+      </w:r>
+      <w:r>
+        <w:t xml:space="preserve"/>
+      </w:r>
+      <w:r>
+        <w:t/>
+      </w:r>
+      <w:r>
+        <w:t xml:space="preserve"/>
+      </w:r>
+      <w:r>
+        <w:t/>
       </w:r>
     </w:p>
     <w:p>
@@ -472,21 +472,21 @@
           <w:b/>
           <w:bCs/>
         </w:rPr>
-        <w:t>Gestión de Reservas de Laboratorio</w:t>
-      </w:r>
-      <w:r>
-        <w:t xml:space="preserve"> | C#, .NET, </w:t>
-      </w:r>
-      <w:proofErr w:type="spellStart"/>
-      <w:r>
-        <w:t>Supabase</w:t>
-      </w:r>
-      <w:proofErr w:type="spellEnd"/>
-      <w:r>
-        <w:t xml:space="preserve">, </w:t>
-      </w:r>
-      <w:r>
-        <w:t>POO</w:t>
+        <w:t>Banco Horizonte — Gestión de reclamos | ASP.NET Core, Angular, PostgreSQL</w:t>
+      </w:r>
+      <w:r>
+        <w:t xml:space="preserve"/>
+      </w:r>
+      <w:proofErr w:type="spellStart"/>
+      <w:r>
+        <w:t/>
+      </w:r>
+      <w:proofErr w:type="spellEnd"/>
+      <w:r>
+        <w:t xml:space="preserve"/>
+      </w:r>
+      <w:r>
+        <w:t/>
       </w:r>
     </w:p>
     <w:p>
@@ -512,15 +512,15 @@
         <w:spacing w:after="60"/>
       </w:pPr>
       <w:r>
-        <w:t xml:space="preserve">Desarrollé un sistema para gestionar reservas de laboratorio con C# y .NET, conectado a </w:t>
-      </w:r>
-      <w:proofErr w:type="spellStart"/>
-      <w:r>
-        <w:t>Supabase</w:t>
-      </w:r>
-      <w:proofErr w:type="spellEnd"/>
-      <w:r>
-        <w:t>.</w:t>
+        <w:t xml:space="preserve">Implementé una API REST en ASP.NET Core para registrar, consultar, asignar y actualizar reclamos con validaciones, historial de cambios y autorización por roles.</w:t>
+      </w:r>
+      <w:proofErr w:type="spellStart"/>
+      <w:r>
+        <w:t/>
+      </w:r>
+      <w:proofErr w:type="spellEnd"/>
+      <w:r>
+        <w:t/>
       </w:r>
     </w:p>
     <w:p>
@@ -530,10 +530,23 @@
           <w:ilvl w:val="0"/>
           <w:numId w:val="1"/>
         </w:numPr>
-        <w:spacing w:after="200"/>
-      </w:pPr>
-      <w:r>
-        <w:t>Organicé la solución con programación orientada a objetos y separación por capas para mantener diferenciadas la lógica de negocio y la persistencia.</w:t>
+        <w:spacing w:after="60"/>
+      </w:pPr>
+      <w:r>
+        <w:t>Diseñé la lógica automática de prioridad y SLA mediante cinco reglas acumulativas, plazos de atención y alertas calculadas según el tiempo consumido.</w:t>
+      </w:r>
+    </w:p>
+    <w:p>
+      <w:pPr>
+        <w:pStyle w:val="ListParagraph"/>
+        <w:numPr>
+          <w:ilvl w:val="0"/>
+          <w:numId w:val="1"/>
+        </w:numPr>
+        <w:spacing w:after="60"/>
+      </w:pPr>
+      <w:r>
+        <w:t>Desarrollé el frontend Angular con autenticación Supabase, guards de rutas, bandeja filtrable, tablero operativo y formularios con mensajes de validación orientados al usuario.</w:t>
       </w:r>
     </w:p>
     <w:p>
@@ -753,7 +766,7 @@
     </w:p>
     <w:sectPr>
       <w:pgSz w:w="11906" w:h="16838"/>
-      <w:pgMar w:top="1440" w:right="1440" w:bottom="1440" w:left="1440" w:header="708" w:footer="708" w:gutter="0"/>
+      <w:pgMar w:top="1080" w:right="1440" w:bottom="1080" w:left="1440" w:header="708" w:footer="708" w:gutter="0"/>
       <w:cols w:space="720"/>
       <w:docGrid w:linePitch="360"/>
     </w:sectPr>

</xml_diff>